<commit_message>
record cold-boot and frame-gap verification on the final firmware
The board boots from the new QSPI image without JTAG: PL DONE/EOS set,
no CRC or IDCODE errors, ping 5/5, serial stat/link responding. The link
command now reads frame-gap statistics; a 22,061 ms restart gap is
recorded in gap_max. Documentation, metrics and measured logs updated
from pending to verified.
</commit_message>
<xml_diff>
--- a/technical_document.docx
+++ b/technical_document.docx
@@ -126,7 +126,25 @@
           <w:i w:val="0"/>
           <w:sz w:val="21"/>
         </w:rPr>
-        <w:t>实现后的静态时序为 WNS 1.341 ns、WHS 0.025 ns，TNS 与 THS 均为 0，失败端点 0；资源为 LUT 28.13%、FF 8.55%、BRAM 70.00%、DSP 19 颗。板上连续推流 8 秒收到 241 帧，折合 30.01 fps；三阶段自检在干净流、注入丢包和恢复流下分别读到 19.0 fps、0 fps 且 13.0 次作废每秒、22.2 fps，判定通过。QSPI 镜像经过擦除、写入和硬件回读校验；断电冷启动在交付前复验。</w:t>
+        <w:t xml:space="preserve">实现后的静态时序为 WNS 1.341 ns、WHS 0.025 ns，TNS 与 THS 均为 0，失败端点 0；资源为 LUT 28.13%、FF 8.55%、BRAM 70.00%、DSP 19 颗。板上连续推流 8 秒收到 241 帧，折合 29.95 fps；三阶段自检在干净流、注入丢包和恢复流下分别读到 22.0 fps、0 fps 且 14.3 次作废每秒、18.9 fps，判定通过。QSPI 镜像经过擦除、写入和硬件回读校验，断电冷启动验证通过；新固件的串口 </w:t>
+      </w:r>
+      <w:r>
+        <w:rPr>
+          <w:rFonts w:ascii="Consolas" w:hAnsi="Consolas" w:eastAsia="宋体"/>
+          <w:b w:val="0"/>
+          <w:i w:val="0"/>
+          <w:sz w:val="20"/>
+        </w:rPr>
+        <w:t>link</w:t>
+      </w:r>
+      <w:r>
+        <w:rPr>
+          <w:rFonts w:ascii="Times New Roman" w:hAnsi="Times New Roman" w:eastAsia="宋体"/>
+          <w:b w:val="0"/>
+          <w:i w:val="0"/>
+          <w:sz w:val="21"/>
+        </w:rPr>
+        <w:t xml:space="preserve"> 命令可直接读出帧间隔统计。</w:t>
       </w:r>
     </w:p>
     <w:p>
@@ -2575,6 +2593,24 @@
           <w:i w:val="0"/>
           <w:sz w:val="20"/>
         </w:rPr>
+        <w:t>stall</w:t>
+      </w:r>
+      <w:r>
+        <w:rPr>
+          <w:rFonts w:ascii="Times New Roman" w:hAnsi="Times New Roman" w:eastAsia="宋体"/>
+          <w:b w:val="0"/>
+          <w:i w:val="0"/>
+          <w:sz w:val="21"/>
+        </w:rPr>
+        <w:t xml:space="preserve"> 是距上一帧的实时毫秒数；</w:t>
+      </w:r>
+      <w:r>
+        <w:rPr>
+          <w:rFonts w:ascii="Consolas" w:hAnsi="Consolas" w:eastAsia="宋体"/>
+          <w:b w:val="0"/>
+          <w:i w:val="0"/>
+          <w:sz w:val="20"/>
+        </w:rPr>
         <w:t>gap_last</w:t>
       </w:r>
       <w:r>
@@ -2584,7 +2620,7 @@
           <w:i w:val="0"/>
           <w:sz w:val="21"/>
         </w:rPr>
-        <w:t xml:space="preserve"> 是最近一帧间隔，</w:t>
+        <w:t xml:space="preserve"> 是最近一次完整帧间隔；</w:t>
       </w:r>
       <w:r>
         <w:rPr>
@@ -2620,7 +2656,7 @@
           <w:i w:val="0"/>
           <w:sz w:val="21"/>
         </w:rPr>
-        <w:t xml:space="preserve"> 是自上次清零以来的最小值和最大值，</w:t>
+        <w:t xml:space="preserve"> 是自上次清零以来的最小值和最大值；</w:t>
       </w:r>
       <w:r>
         <w:rPr>
@@ -2638,7 +2674,7 @@
           <w:i w:val="0"/>
           <w:sz w:val="21"/>
         </w:rPr>
-        <w:t xml:space="preserve"> 是累计间隔，</w:t>
+        <w:t xml:space="preserve"> 是累计间隔；</w:t>
       </w:r>
       <w:r>
         <w:rPr>
@@ -2656,7 +2692,7 @@
           <w:i w:val="0"/>
           <w:sz w:val="21"/>
         </w:rPr>
-        <w:t xml:space="preserve"> 表示统计已经由至少两帧校准；</w:t>
+        <w:t xml:space="preserve"> 表示统计已经由至少两帧校准。</w:t>
       </w:r>
       <w:r>
         <w:rPr>
@@ -2674,7 +2710,133 @@
           <w:i w:val="0"/>
           <w:sz w:val="21"/>
         </w:rPr>
-        <w:t xml:space="preserve"> 在读取之前把统计清零。帧间隔按毫秒计数，计数到 </w:t>
+        <w:t xml:space="preserve"> 清零 </w:t>
+      </w:r>
+      <w:r>
+        <w:rPr>
+          <w:rFonts w:ascii="Consolas" w:hAnsi="Consolas" w:eastAsia="宋体"/>
+          <w:b w:val="0"/>
+          <w:i w:val="0"/>
+          <w:sz w:val="20"/>
+        </w:rPr>
+        <w:t>gap_*</w:t>
+      </w:r>
+      <w:r>
+        <w:rPr>
+          <w:rFonts w:ascii="Times New Roman" w:hAnsi="Times New Roman" w:eastAsia="宋体"/>
+          <w:b w:val="0"/>
+          <w:i w:val="0"/>
+          <w:sz w:val="21"/>
+        </w:rPr>
+        <w:t xml:space="preserve">，但不改 </w:t>
+      </w:r>
+      <w:r>
+        <w:rPr>
+          <w:rFonts w:ascii="Consolas" w:hAnsi="Consolas" w:eastAsia="宋体"/>
+          <w:b w:val="0"/>
+          <w:i w:val="0"/>
+          <w:sz w:val="20"/>
+        </w:rPr>
+        <w:t>stall</w:t>
+      </w:r>
+      <w:r>
+        <w:rPr>
+          <w:rFonts w:ascii="Times New Roman" w:hAnsi="Times New Roman" w:eastAsia="宋体"/>
+          <w:b w:val="0"/>
+          <w:i w:val="0"/>
+          <w:sz w:val="21"/>
+        </w:rPr>
+        <w:t>。</w:t>
+      </w:r>
+      <w:r>
+        <w:rPr>
+          <w:rFonts w:ascii="Consolas" w:hAnsi="Consolas" w:eastAsia="宋体"/>
+          <w:b w:val="0"/>
+          <w:i w:val="0"/>
+          <w:sz w:val="20"/>
+        </w:rPr>
+        <w:t>gap_last</w:t>
+      </w:r>
+      <w:r>
+        <w:rPr>
+          <w:rFonts w:ascii="Times New Roman" w:hAnsi="Times New Roman" w:eastAsia="宋体"/>
+          <w:b w:val="0"/>
+          <w:i w:val="0"/>
+          <w:sz w:val="21"/>
+        </w:rPr>
+        <w:t>/</w:t>
+      </w:r>
+      <w:r>
+        <w:rPr>
+          <w:rFonts w:ascii="Consolas" w:hAnsi="Consolas" w:eastAsia="宋体"/>
+          <w:b w:val="0"/>
+          <w:i w:val="0"/>
+          <w:sz w:val="20"/>
+        </w:rPr>
+        <w:t>gap_max</w:t>
+      </w:r>
+      <w:r>
+        <w:rPr>
+          <w:rFonts w:ascii="Times New Roman" w:hAnsi="Times New Roman" w:eastAsia="宋体"/>
+          <w:b w:val="0"/>
+          <w:i w:val="0"/>
+          <w:sz w:val="21"/>
+        </w:rPr>
+        <w:t xml:space="preserve"> 在帧完成时更新，因此停流期间增长的是 </w:t>
+      </w:r>
+      <w:r>
+        <w:rPr>
+          <w:rFonts w:ascii="Consolas" w:hAnsi="Consolas" w:eastAsia="宋体"/>
+          <w:b w:val="0"/>
+          <w:i w:val="0"/>
+          <w:sz w:val="20"/>
+        </w:rPr>
+        <w:t>stall</w:t>
+      </w:r>
+      <w:r>
+        <w:rPr>
+          <w:rFonts w:ascii="Times New Roman" w:hAnsi="Times New Roman" w:eastAsia="宋体"/>
+          <w:b w:val="0"/>
+          <w:i w:val="0"/>
+          <w:sz w:val="21"/>
+        </w:rPr>
+        <w:t xml:space="preserve">，下一帧到达时长间隔才写入 </w:t>
+      </w:r>
+      <w:r>
+        <w:rPr>
+          <w:rFonts w:ascii="Consolas" w:hAnsi="Consolas" w:eastAsia="宋体"/>
+          <w:b w:val="0"/>
+          <w:i w:val="0"/>
+          <w:sz w:val="20"/>
+        </w:rPr>
+        <w:t>gap_last</w:t>
+      </w:r>
+      <w:r>
+        <w:rPr>
+          <w:rFonts w:ascii="Times New Roman" w:hAnsi="Times New Roman" w:eastAsia="宋体"/>
+          <w:b w:val="0"/>
+          <w:i w:val="0"/>
+          <w:sz w:val="21"/>
+        </w:rPr>
+        <w:t>/</w:t>
+      </w:r>
+      <w:r>
+        <w:rPr>
+          <w:rFonts w:ascii="Consolas" w:hAnsi="Consolas" w:eastAsia="宋体"/>
+          <w:b w:val="0"/>
+          <w:i w:val="0"/>
+          <w:sz w:val="20"/>
+        </w:rPr>
+        <w:t>gap_max</w:t>
+      </w:r>
+      <w:r>
+        <w:rPr>
+          <w:rFonts w:ascii="Times New Roman" w:hAnsi="Times New Roman" w:eastAsia="宋体"/>
+          <w:b w:val="0"/>
+          <w:i w:val="0"/>
+          <w:sz w:val="21"/>
+        </w:rPr>
+        <w:t xml:space="preserve">。帧间隔按毫秒计数，计数到 </w:t>
       </w:r>
       <w:r>
         <w:rPr>
@@ -6171,7 +6333,25 @@
                 <w:i w:val="0"/>
                 <w:sz w:val="18"/>
               </w:rPr>
-              <w:t xml:space="preserve"> 有回显</w:t>
+              <w:t>/</w:t>
+            </w:r>
+            <w:r>
+              <w:rPr>
+                <w:rFonts w:ascii="Consolas" w:hAnsi="Consolas" w:eastAsia="宋体"/>
+                <w:b w:val="0"/>
+                <w:i w:val="0"/>
+                <w:sz w:val="17"/>
+              </w:rPr>
+              <w:t>link</w:t>
+            </w:r>
+            <w:r>
+              <w:rPr>
+                <w:rFonts w:ascii="Times New Roman" w:hAnsi="Times New Roman" w:eastAsia="宋体"/>
+                <w:b w:val="0"/>
+                <w:i w:val="0"/>
+                <w:sz w:val="18"/>
+              </w:rPr>
+              <w:t xml:space="preserve"> 有回显；ping 5/5</w:t>
             </w:r>
           </w:p>
         </w:tc>
@@ -6192,7 +6372,7 @@
                 <w:i w:val="0"/>
                 <w:sz w:val="18"/>
               </w:rPr>
-              <w:t>待复验</w:t>
+              <w:t>通过</w:t>
             </w:r>
           </w:p>
         </w:tc>
@@ -6257,7 +6437,7 @@
                 <w:i w:val="0"/>
                 <w:sz w:val="18"/>
               </w:rPr>
-              <w:t>241 帧 / 8.03 s = 30.01 fps</w:t>
+              <w:t>241 帧 / 8.05 s = 29.95 fps</w:t>
             </w:r>
           </w:p>
         </w:tc>
@@ -6429,7 +6609,7 @@
                 <w:i w:val="0"/>
                 <w:sz w:val="18"/>
               </w:rPr>
-              <w:t>19.0 fps；0 fps + 13.0 次作废每秒；22.2 fps</w:t>
+              <w:t>22.0 fps；0 fps + 14.3 次作废每秒；18.9 fps</w:t>
             </w:r>
           </w:p>
         </w:tc>
@@ -6598,7 +6778,7 @@
                 <w:i w:val="0"/>
                 <w:sz w:val="18"/>
               </w:rPr>
-              <w:t xml:space="preserve"> 后推流、停流、再读</w:t>
+              <w:t xml:space="preserve"> 后推流、停流、重启</w:t>
             </w:r>
           </w:p>
         </w:tc>
@@ -6614,12 +6794,21 @@
             <w:r/>
             <w:r>
               <w:rPr>
+                <w:rFonts w:ascii="Times New Roman" w:hAnsi="Times New Roman" w:eastAsia="宋体"/>
+                <w:b w:val="0"/>
+                <w:i w:val="0"/>
+                <w:sz w:val="18"/>
+              </w:rPr>
+              <w:t xml:space="preserve">推流中 </w:t>
+            </w:r>
+            <w:r>
+              <w:rPr>
                 <w:rFonts w:ascii="Consolas" w:hAnsi="Consolas" w:eastAsia="宋体"/>
                 <w:b w:val="0"/>
                 <w:i w:val="0"/>
                 <w:sz w:val="17"/>
               </w:rPr>
-              <w:t>gap_last/min/max/sum</w:t>
+              <w:t>gap_last=28 ms</w:t>
             </w:r>
             <w:r>
               <w:rPr>
@@ -6628,7 +6817,7 @@
                 <w:i w:val="0"/>
                 <w:sz w:val="18"/>
               </w:rPr>
-              <w:t xml:space="preserve"> 更新，</w:t>
+              <w:t>、</w:t>
             </w:r>
             <w:r>
               <w:rPr>
@@ -6637,7 +6826,61 @@
                 <w:i w:val="0"/>
                 <w:sz w:val="17"/>
               </w:rPr>
+              <w:t>gap_max=49 ms</w:t>
+            </w:r>
+            <w:r>
+              <w:rPr>
+                <w:rFonts w:ascii="Times New Roman" w:hAnsi="Times New Roman" w:eastAsia="宋体"/>
+                <w:b w:val="0"/>
+                <w:i w:val="0"/>
+                <w:sz w:val="18"/>
+              </w:rPr>
+              <w:t>、</w:t>
+            </w:r>
+            <w:r>
+              <w:rPr>
+                <w:rFonts w:ascii="Consolas" w:hAnsi="Consolas" w:eastAsia="宋体"/>
+                <w:b w:val="0"/>
+                <w:i w:val="0"/>
+                <w:sz w:val="17"/>
+              </w:rPr>
               <w:t>gap_valid=1</w:t>
+            </w:r>
+            <w:r>
+              <w:rPr>
+                <w:rFonts w:ascii="Times New Roman" w:hAnsi="Times New Roman" w:eastAsia="宋体"/>
+                <w:b w:val="0"/>
+                <w:i w:val="0"/>
+                <w:sz w:val="18"/>
+              </w:rPr>
+              <w:t xml:space="preserve">；停流 </w:t>
+            </w:r>
+            <w:r>
+              <w:rPr>
+                <w:rFonts w:ascii="Consolas" w:hAnsi="Consolas" w:eastAsia="宋体"/>
+                <w:b w:val="0"/>
+                <w:i w:val="0"/>
+                <w:sz w:val="17"/>
+              </w:rPr>
+              <w:t>stall</w:t>
+            </w:r>
+            <w:r>
+              <w:rPr>
+                <w:rFonts w:ascii="Times New Roman" w:hAnsi="Times New Roman" w:eastAsia="宋体"/>
+                <w:b w:val="0"/>
+                <w:i w:val="0"/>
+                <w:sz w:val="18"/>
+              </w:rPr>
+              <w:t xml:space="preserve"> 增长；重启后 </w:t>
+            </w:r>
+            <w:r>
+              <w:rPr>
+                <w:rFonts w:ascii="Consolas" w:hAnsi="Consolas" w:eastAsia="宋体"/>
+                <w:b w:val="0"/>
+                <w:i w:val="0"/>
+                <w:sz w:val="17"/>
+              </w:rPr>
+              <w:t>gap_max=22 061 ms</w:t>
             </w:r>
           </w:p>
         </w:tc>
@@ -6658,7 +6901,7 @@
                 <w:i w:val="0"/>
                 <w:sz w:val="18"/>
               </w:rPr>
-              <w:t>待上板复验</w:t>
+              <w:t>通过</w:t>
             </w:r>
           </w:p>
         </w:tc>
@@ -8821,7 +9064,7 @@
           <w:i w:val="0"/>
           <w:sz w:val="21"/>
         </w:rPr>
-        <w:t>这套系统把一条全硬件视频通路和一套可被证伪的观测手段绑在一起。它能在 512×300、30 fps 的输入下稳定输出 1024×600、59.5 Hz 的画面，效果链延迟恒为 15 个像素时钟，同帧竖缝提供像素级对照，遥测和串口提供帧数、坏包、作废、缺行、时延、处理窗完整性和帧间隔统计。三阶段自检能证明仪表会变红；QSPI 镜像完成写入与回读校验，冷启动在交付前复验。</w:t>
+        <w:t>这套系统把一条全硬件视频通路和一套可被证伪的观测手段绑在一起。它能在 512×300、30 fps 的输入下稳定输出 1024×600、59.5 Hz 的画面，效果链延迟恒为 15 个像素时钟，同帧竖缝提供像素级对照，遥测和串口提供帧数、坏包、作废、缺行、时延、处理窗完整性和帧间隔统计。三阶段自检能证明仪表会变红；QSPI 镜像完成写入与回读校验，断电冷启动验证通过。</w:t>
       </w:r>
     </w:p>
     <w:p>

</xml_diff>

<commit_message>
clarify the A9 frame-reassembly fix in the design docs
The final RTL uses a 4 ms idle timer with a 12-bit prescaler, not the
rejected unprescaled timer or the last_hdr comparison. The bench requires
two frames not to merge after silence and the third frame to commit
cleanly. Documentation and the generated technical PDF updated.
</commit_message>
<xml_diff>
--- a/technical_document.docx
+++ b/technical_document.docx
@@ -638,6 +638,21 @@
           <w:sz w:val="21"/>
         </w:rPr>
         <w:t>接收侧从 RGMII 开始。四个数据位和控制位先用 IDDR 在 PHY 恢复时钟上采样，再通过异步 FIFO 搬到 125 MHz 的逻辑时钟域。MAC、ARP、ICMP、UDP 端口过滤、按帧内偏移重组和统计都在这个时钟域完成。重组器只有在整帧字节数到齐、所有源行都被覆盖、且本帧没有坏包时才发出提交脉冲；提交之后，16 位像素被打包成 64 位字，由 PL 作为 AXI HP0 主设备写入 DDR 乒乓缓存。</w:t>
+      </w:r>
+    </w:p>
+    <w:p>
+      <w:pPr>
+        <w:spacing w:before="0" w:after="80" w:line="324" w:lineRule="auto"/>
+        <w:ind w:firstLine="420"/>
+      </w:pPr>
+      <w:r>
+        <w:rPr>
+          <w:rFonts w:ascii="Times New Roman" w:hAnsi="Times New Roman" w:eastAsia="宋体"/>
+          <w:b w:val="0"/>
+          <w:i w:val="0"/>
+          <w:sz w:val="21"/>
+        </w:rPr>
+        <w:t>如果一帧收了一半后链路静默超过 4 ms，idle timer 会把半帧作废，防止上一帧的尾和下一帧的头拼成一整帧。计时器用 12 位预分频，只把一个单 bit 送进 header 清位锥，不把 4 ms 计数器挂在字节/行路径上。</w:t>
       </w:r>
     </w:p>
     <w:p>

</xml_diff>